<commit_message>
Documento de Depuración de Código
</commit_message>
<xml_diff>
--- a/UD3/P1/UD3_Actividad_01_Depuracion_codigo_MarcoValiente.docx
+++ b/UD3/P1/UD3_Actividad_01_Depuracion_codigo_MarcoValiente.docx
@@ -2,10 +2,14 @@
 <file path=word/document.xml><?xml version="1.0" encoding="utf-8"?>
 <w:document xmlns:wpc="http://schemas.microsoft.com/office/word/2010/wordprocessingCanvas" xmlns:cx="http://schemas.microsoft.com/office/drawing/2014/chartex" xmlns:mc="http://schemas.openxmlformats.org/markup-compatibility/2006" xmlns:o="urn:schemas-microsoft-com:office:office" xmlns:r="http://schemas.openxmlformats.org/officeDocument/2006/relationships" xmlns:m="http://schemas.openxmlformats.org/officeDocument/2006/math" xmlns:v="urn:schemas-microsoft-com:vml" xmlns:wp14="http://schemas.microsoft.com/office/word/2010/wordprocessingDrawing" xmlns:wp="http://schemas.openxmlformats.org/drawingml/2006/wordprocessingDrawing" xmlns:w10="urn:schemas-microsoft-com:office:word" xmlns:w="http://schemas.openxmlformats.org/wordprocessingml/2006/main" xmlns:w14="http://schemas.microsoft.com/office/word/2010/wordml" xmlns:w15="http://schemas.microsoft.com/office/word/2012/wordml" xmlns:w16se="http://schemas.microsoft.com/office/word/2015/wordml/symex" xmlns:wpg="http://schemas.microsoft.com/office/word/2010/wordprocessingGroup" xmlns:wpi="http://schemas.microsoft.com/office/word/2010/wordprocessingInk" xmlns:wne="http://schemas.microsoft.com/office/word/2006/wordml" xmlns:wps="http://schemas.microsoft.com/office/word/2010/wordprocessingShape" mc:Ignorable="w14 w15 w16se wp14">
   <w:body>
+    <w:bookmarkStart w:id="0" w:name="_GoBack" w:displacedByCustomXml="next"/>
+    <w:bookmarkEnd w:id="0" w:displacedByCustomXml="next"/>
     <w:sdt>
       <w:sdtPr>
         <w:rPr>
+          <w:rFonts w:eastAsiaTheme="minorHAnsi"/>
           <w:sz w:val="2"/>
+          <w:lang w:eastAsia="en-US"/>
         </w:rPr>
         <w:id w:val="-1804533562"/>
         <w:docPartObj>
@@ -15,9 +19,7 @@
       </w:sdtPr>
       <w:sdtEndPr>
         <w:rPr>
-          <w:rFonts w:eastAsiaTheme="minorHAnsi"/>
           <w:sz w:val="22"/>
-          <w:lang w:eastAsia="en-US"/>
         </w:rPr>
       </w:sdtEndPr>
       <w:sdtContent>
@@ -33,6 +35,7 @@
           <w:r>
             <w:rPr>
               <w:noProof/>
+              <w:lang w:eastAsia="es-ES"/>
             </w:rPr>
             <mc:AlternateContent>
               <mc:Choice Requires="wps">
@@ -153,6 +156,7 @@
                                     <w:dataBinding w:prefixMappings="xmlns:ns0='http://purl.org/dc/elements/1.1/' xmlns:ns1='http://schemas.openxmlformats.org/package/2006/metadata/core-properties' " w:xpath="/ns1:coreProperties[1]/ns0:subject[1]" w:storeItemID="{6C3C8BC8-F283-45AE-878A-BAB7291924A1}"/>
                                     <w:text/>
                                   </w:sdtPr>
+                                  <w:sdtEndPr/>
                                   <w:sdtContent>
                                     <w:r>
                                       <w:rPr>
@@ -294,6 +298,7 @@
               <w:color w:val="5B9BD5" w:themeColor="accent1"/>
               <w:sz w:val="36"/>
               <w:szCs w:val="36"/>
+              <w:lang w:eastAsia="es-ES"/>
             </w:rPr>
             <mc:AlternateContent>
               <mc:Choice Requires="wpg">
@@ -826,6 +831,7 @@
           <w:r>
             <w:rPr>
               <w:noProof/>
+              <w:lang w:eastAsia="es-ES"/>
             </w:rPr>
             <mc:AlternateContent>
               <mc:Choice Requires="wps">
@@ -900,6 +906,7 @@
                                     <w:dataBinding w:prefixMappings="xmlns:ns0='http://schemas.openxmlformats.org/officeDocument/2006/extended-properties' " w:xpath="/ns0:Properties[1]/ns0:Company[1]" w:storeItemID="{6668398D-A668-4E3E-A5EB-62B293D839F1}"/>
                                     <w:text/>
                                   </w:sdtPr>
+                                  <w:sdtEndPr/>
                                   <w:sdtContent>
                                     <w:r>
                                       <w:rPr>
@@ -925,6 +932,7 @@
                                   <w:dataBinding w:prefixMappings="xmlns:ns0='http://purl.org/dc/elements/1.1/' xmlns:ns1='http://schemas.openxmlformats.org/package/2006/metadata/core-properties' " w:xpath="/ns1:coreProperties[1]/ns1:category[1]" w:storeItemID="{6C3C8BC8-F283-45AE-878A-BAB7291924A1}"/>
                                   <w:text/>
                                 </w:sdtPr>
+                                <w:sdtEndPr/>
                                 <w:sdtContent>
                                   <w:p>
                                     <w:pPr>
@@ -1060,6 +1068,13 @@
     </w:sdt>
     <w:sdt>
       <w:sdtPr>
+        <w:rPr>
+          <w:rFonts w:asciiTheme="minorHAnsi" w:eastAsiaTheme="minorHAnsi" w:hAnsiTheme="minorHAnsi" w:cstheme="minorBidi"/>
+          <w:color w:val="auto"/>
+          <w:sz w:val="22"/>
+          <w:szCs w:val="22"/>
+          <w:lang w:eastAsia="en-US"/>
+        </w:rPr>
         <w:id w:val="1212917707"/>
         <w:docPartObj>
           <w:docPartGallery w:val="Table of Contents"/>
@@ -1068,13 +1083,8 @@
       </w:sdtPr>
       <w:sdtEndPr>
         <w:rPr>
-          <w:rFonts w:asciiTheme="minorHAnsi" w:eastAsiaTheme="minorHAnsi" w:hAnsiTheme="minorHAnsi" w:cstheme="minorBidi"/>
           <w:b/>
           <w:bCs/>
-          <w:color w:val="auto"/>
-          <w:sz w:val="22"/>
-          <w:szCs w:val="22"/>
-          <w:lang w:eastAsia="en-US"/>
         </w:rPr>
       </w:sdtEndPr>
       <w:sdtContent>
@@ -1085,8 +1095,6 @@
           <w:r>
             <w:t>Contenido</w:t>
           </w:r>
-          <w:bookmarkStart w:id="0" w:name="_GoBack"/>
-          <w:bookmarkEnd w:id="0"/>
         </w:p>
         <w:p>
           <w:pPr>
@@ -1510,7 +1518,23 @@
     <w:p/>
     <w:p>
       <w:r>
-        <w:t>En este documento, vamos a realizar una actualización sobre cómo el código de nuestros programas se ejecuta, siguiendo a través de la herramienta de debuggear en IntelliJ cómo van cambiando nuestras variables.</w:t>
+        <w:t xml:space="preserve">En este documento, vamos a realizar una actualización sobre cómo el código de nuestros programas se ejecuta, siguiendo a través de la herramienta de </w:t>
+      </w:r>
+      <w:proofErr w:type="spellStart"/>
+      <w:r>
+        <w:t>debuggear</w:t>
+      </w:r>
+      <w:proofErr w:type="spellEnd"/>
+      <w:r>
+        <w:t xml:space="preserve"> en </w:t>
+      </w:r>
+      <w:proofErr w:type="spellStart"/>
+      <w:r>
+        <w:t>IntelliJ</w:t>
+      </w:r>
+      <w:proofErr w:type="spellEnd"/>
+      <w:r>
+        <w:t xml:space="preserve"> cómo van cambiando nuestras variables.</w:t>
       </w:r>
     </w:p>
     <w:p>
@@ -1556,6 +1580,10 @@
     </w:p>
     <w:p>
       <w:r>
+        <w:rPr>
+          <w:noProof/>
+          <w:lang w:eastAsia="es-ES"/>
+        </w:rPr>
         <w:drawing>
           <wp:inline distT="0" distB="0" distL="0" distR="0" wp14:anchorId="1227C1CD" wp14:editId="1A429683">
             <wp:extent cx="5400040" cy="1798955"/>
@@ -1605,6 +1633,10 @@
     </w:p>
     <w:p>
       <w:r>
+        <w:rPr>
+          <w:noProof/>
+          <w:lang w:eastAsia="es-ES"/>
+        </w:rPr>
         <w:drawing>
           <wp:inline distT="0" distB="0" distL="0" distR="0" wp14:anchorId="0794EC8C" wp14:editId="774358E0">
             <wp:extent cx="5400040" cy="471805"/>
@@ -1644,11 +1676,20 @@
     </w:p>
     <w:p>
       <w:r>
-        <w:t>Cómo se crea el LinkedHashMap</w:t>
-      </w:r>
-    </w:p>
-    <w:p>
-      <w:r>
+        <w:t xml:space="preserve">Cómo se crea el </w:t>
+      </w:r>
+      <w:proofErr w:type="spellStart"/>
+      <w:r>
+        <w:t>LinkedHashMap</w:t>
+      </w:r>
+      <w:proofErr w:type="spellEnd"/>
+    </w:p>
+    <w:p>
+      <w:r>
+        <w:rPr>
+          <w:noProof/>
+          <w:lang w:eastAsia="es-ES"/>
+        </w:rPr>
         <w:lastRenderedPageBreak/>
         <w:drawing>
           <wp:inline distT="0" distB="0" distL="0" distR="0" wp14:anchorId="6DB5750B" wp14:editId="655827F2">
@@ -1699,6 +1740,10 @@
     </w:p>
     <w:p>
       <w:r>
+        <w:rPr>
+          <w:noProof/>
+          <w:lang w:eastAsia="es-ES"/>
+        </w:rPr>
         <w:drawing>
           <wp:inline distT="0" distB="0" distL="0" distR="0" wp14:anchorId="02015FFC" wp14:editId="09CBFDB3">
             <wp:extent cx="5400040" cy="1120140"/>
@@ -1743,6 +1788,10 @@
     </w:p>
     <w:p>
       <w:r>
+        <w:rPr>
+          <w:noProof/>
+          <w:lang w:eastAsia="es-ES"/>
+        </w:rPr>
         <w:drawing>
           <wp:inline distT="0" distB="0" distL="0" distR="0" wp14:anchorId="71D06384" wp14:editId="6286A538">
             <wp:extent cx="5400040" cy="1267460"/>
@@ -1797,13 +1846,22 @@
       <w:bookmarkStart w:id="4" w:name="_Toc221270415"/>
       <w:r>
         <w:lastRenderedPageBreak/>
-        <w:t>Inicio del Debug</w:t>
+        <w:t xml:space="preserve">Inicio del </w:t>
+      </w:r>
+      <w:proofErr w:type="spellStart"/>
+      <w:r>
+        <w:t>Debug</w:t>
       </w:r>
       <w:bookmarkEnd w:id="4"/>
+      <w:proofErr w:type="spellEnd"/>
     </w:p>
     <w:p/>
     <w:p>
       <w:r>
+        <w:rPr>
+          <w:noProof/>
+          <w:lang w:eastAsia="es-ES"/>
+        </w:rPr>
         <w:drawing>
           <wp:inline distT="0" distB="0" distL="0" distR="0" wp14:anchorId="627D4403" wp14:editId="7AA70BCA">
             <wp:extent cx="3791479" cy="800212"/>
@@ -1843,11 +1901,31 @@
     </w:p>
     <w:p>
       <w:r>
-        <w:t>Con los errores marcados, iniciamos el programa dándole click a Debug.</w:t>
-      </w:r>
-    </w:p>
-    <w:p>
-      <w:r>
+        <w:t xml:space="preserve">Con los errores marcados, iniciamos el programa dándole </w:t>
+      </w:r>
+      <w:proofErr w:type="spellStart"/>
+      <w:r>
+        <w:t>click</w:t>
+      </w:r>
+      <w:proofErr w:type="spellEnd"/>
+      <w:r>
+        <w:t xml:space="preserve"> a </w:t>
+      </w:r>
+      <w:proofErr w:type="spellStart"/>
+      <w:r>
+        <w:t>Debug</w:t>
+      </w:r>
+      <w:proofErr w:type="spellEnd"/>
+      <w:r>
+        <w:t>.</w:t>
+      </w:r>
+    </w:p>
+    <w:p>
+      <w:r>
+        <w:rPr>
+          <w:noProof/>
+          <w:lang w:eastAsia="es-ES"/>
+        </w:rPr>
         <w:drawing>
           <wp:inline distT="0" distB="0" distL="0" distR="0" wp14:anchorId="757C4961" wp14:editId="3C17F7F6">
             <wp:extent cx="5400040" cy="2463800"/>
@@ -1887,11 +1965,31 @@
     </w:p>
     <w:p>
       <w:r>
-        <w:t>Le damos click, e inmediatamente paramos el programa en la 13ª línea. Podemos observar desde aquí que el Patrón y los argumentos del main son las únicas cosas que actualmente están ejecutadas.</w:t>
-      </w:r>
-    </w:p>
-    <w:p>
-      <w:r>
+        <w:t xml:space="preserve">Le damos </w:t>
+      </w:r>
+      <w:proofErr w:type="spellStart"/>
+      <w:r>
+        <w:t>click</w:t>
+      </w:r>
+      <w:proofErr w:type="spellEnd"/>
+      <w:r>
+        <w:t xml:space="preserve">, e inmediatamente paramos el programa en la 13ª línea. Podemos observar desde aquí que el Patrón y los argumentos del </w:t>
+      </w:r>
+      <w:proofErr w:type="spellStart"/>
+      <w:r>
+        <w:t>main</w:t>
+      </w:r>
+      <w:proofErr w:type="spellEnd"/>
+      <w:r>
+        <w:t xml:space="preserve"> son las únicas cosas que actualmente están ejecutadas.</w:t>
+      </w:r>
+    </w:p>
+    <w:p>
+      <w:r>
+        <w:rPr>
+          <w:noProof/>
+          <w:lang w:eastAsia="es-ES"/>
+        </w:rPr>
         <w:drawing>
           <wp:inline distT="0" distB="0" distL="0" distR="0" wp14:anchorId="7E907D98" wp14:editId="082F1946">
             <wp:extent cx="1152686" cy="352474"/>
@@ -1931,7 +2029,23 @@
     </w:p>
     <w:p>
       <w:r>
-        <w:t>Seleccionamos ahora Step Into, para ver dónde nos están metiendo.</w:t>
+        <w:t xml:space="preserve">Seleccionamos ahora </w:t>
+      </w:r>
+      <w:proofErr w:type="spellStart"/>
+      <w:r>
+        <w:t>Step</w:t>
+      </w:r>
+      <w:proofErr w:type="spellEnd"/>
+      <w:r>
+        <w:t xml:space="preserve"> </w:t>
+      </w:r>
+      <w:proofErr w:type="spellStart"/>
+      <w:r>
+        <w:t>Into</w:t>
+      </w:r>
+      <w:proofErr w:type="spellEnd"/>
+      <w:r>
+        <w:t>, para ver dónde nos están metiendo.</w:t>
       </w:r>
     </w:p>
     <w:p>
@@ -1941,6 +2055,10 @@
     </w:p>
     <w:p>
       <w:r>
+        <w:rPr>
+          <w:noProof/>
+          <w:lang w:eastAsia="es-ES"/>
+        </w:rPr>
         <w:drawing>
           <wp:inline distT="0" distB="0" distL="0" distR="0" wp14:anchorId="11E93905" wp14:editId="3B3D3D33">
             <wp:extent cx="5400040" cy="2758440"/>
@@ -1981,11 +2099,31 @@
     <w:p>
       <w:r>
         <w:lastRenderedPageBreak/>
-        <w:t>Pero esto no nos interesa ya. Podemos usar Step Out para saltar a nuestro siguiente punto en rojo.</w:t>
-      </w:r>
-    </w:p>
-    <w:p>
-      <w:r>
+        <w:t xml:space="preserve">Pero esto no nos interesa ya. Podemos usar </w:t>
+      </w:r>
+      <w:proofErr w:type="spellStart"/>
+      <w:r>
+        <w:t>Step</w:t>
+      </w:r>
+      <w:proofErr w:type="spellEnd"/>
+      <w:r>
+        <w:t xml:space="preserve"> </w:t>
+      </w:r>
+      <w:proofErr w:type="spellStart"/>
+      <w:r>
+        <w:t>Out</w:t>
+      </w:r>
+      <w:proofErr w:type="spellEnd"/>
+      <w:r>
+        <w:t xml:space="preserve"> para saltar a nuestro siguiente punto en rojo.</w:t>
+      </w:r>
+    </w:p>
+    <w:p>
+      <w:r>
+        <w:rPr>
+          <w:noProof/>
+          <w:lang w:eastAsia="es-ES"/>
+        </w:rPr>
         <w:drawing>
           <wp:inline distT="0" distB="0" distL="0" distR="0" wp14:anchorId="376192D6" wp14:editId="354AF642">
             <wp:extent cx="5400040" cy="1762125"/>
@@ -2039,11 +2177,31 @@
     </w:p>
     <w:p>
       <w:r>
-        <w:t>Aquí podemos seguir con Step Over para continuar con cómo se va leyendo el programa.</w:t>
-      </w:r>
-    </w:p>
-    <w:p>
-      <w:r>
+        <w:t xml:space="preserve">Aquí podemos seguir con </w:t>
+      </w:r>
+      <w:proofErr w:type="spellStart"/>
+      <w:r>
+        <w:t>Step</w:t>
+      </w:r>
+      <w:proofErr w:type="spellEnd"/>
+      <w:r>
+        <w:t xml:space="preserve"> </w:t>
+      </w:r>
+      <w:proofErr w:type="spellStart"/>
+      <w:r>
+        <w:t>Over</w:t>
+      </w:r>
+      <w:proofErr w:type="spellEnd"/>
+      <w:r>
+        <w:t xml:space="preserve"> para continuar con cómo se va leyendo el programa.</w:t>
+      </w:r>
+    </w:p>
+    <w:p>
+      <w:r>
+        <w:rPr>
+          <w:noProof/>
+          <w:lang w:eastAsia="es-ES"/>
+        </w:rPr>
         <w:drawing>
           <wp:inline distT="0" distB="0" distL="0" distR="0" wp14:anchorId="17D605A4" wp14:editId="08A318E2">
             <wp:extent cx="5400040" cy="2826385"/>
@@ -2083,11 +2241,23 @@
     </w:p>
     <w:p>
       <w:r>
-        <w:t>Seguimos leyendo, el FileReader ha sido creado de forma exitosa.</w:t>
-      </w:r>
-    </w:p>
-    <w:p>
-      <w:r>
+        <w:t xml:space="preserve">Seguimos leyendo, el </w:t>
+      </w:r>
+      <w:proofErr w:type="spellStart"/>
+      <w:r>
+        <w:t>FileReader</w:t>
+      </w:r>
+      <w:proofErr w:type="spellEnd"/>
+      <w:r>
+        <w:t xml:space="preserve"> ha sido creado de forma exitosa.</w:t>
+      </w:r>
+    </w:p>
+    <w:p>
+      <w:r>
+        <w:rPr>
+          <w:noProof/>
+          <w:lang w:eastAsia="es-ES"/>
+        </w:rPr>
         <w:drawing>
           <wp:inline distT="0" distB="0" distL="0" distR="0" wp14:anchorId="73FE4155" wp14:editId="7C1D52A9">
             <wp:extent cx="4620270" cy="1133633"/>
@@ -2127,7 +2297,15 @@
     </w:p>
     <w:p>
       <w:r>
-        <w:t>Podemos ver que line es diferente a null, ya que esta tiene el contenido “”, lo que es considerado distinto.</w:t>
+        <w:t xml:space="preserve">Podemos ver que line es diferente a </w:t>
+      </w:r>
+      <w:proofErr w:type="spellStart"/>
+      <w:r>
+        <w:t>null</w:t>
+      </w:r>
+      <w:proofErr w:type="spellEnd"/>
+      <w:r>
+        <w:t>, ya que esta tiene el contenido “”, lo que es considerado distinto.</w:t>
       </w:r>
     </w:p>
     <w:p/>
@@ -2135,11 +2313,23 @@
     <w:p>
       <w:r>
         <w:lastRenderedPageBreak/>
-        <w:t>Marcamos la línea con el punto para poder comprobar su valor en cada loop.</w:t>
-      </w:r>
-    </w:p>
-    <w:p>
-      <w:r>
+        <w:t xml:space="preserve">Marcamos la línea con el punto para poder comprobar su valor en cada </w:t>
+      </w:r>
+      <w:proofErr w:type="spellStart"/>
+      <w:r>
+        <w:t>loop</w:t>
+      </w:r>
+      <w:proofErr w:type="spellEnd"/>
+      <w:r>
+        <w:t>.</w:t>
+      </w:r>
+    </w:p>
+    <w:p>
+      <w:r>
+        <w:rPr>
+          <w:noProof/>
+          <w:lang w:eastAsia="es-ES"/>
+        </w:rPr>
         <w:drawing>
           <wp:inline distT="0" distB="0" distL="0" distR="0" wp14:anchorId="0BF9161C" wp14:editId="6DD1D542">
             <wp:extent cx="4915586" cy="514422"/>
@@ -2179,11 +2369,31 @@
     </w:p>
     <w:p>
       <w:r>
-        <w:t>Y ahora, para no ir manualmente por cada objeto leído de nuestro archivo, podemos usar Step Out.</w:t>
-      </w:r>
-    </w:p>
-    <w:p>
-      <w:r>
+        <w:t xml:space="preserve">Y ahora, para no ir manualmente por cada objeto leído de nuestro archivo, podemos usar </w:t>
+      </w:r>
+      <w:proofErr w:type="spellStart"/>
+      <w:r>
+        <w:t>Step</w:t>
+      </w:r>
+      <w:proofErr w:type="spellEnd"/>
+      <w:r>
+        <w:t xml:space="preserve"> </w:t>
+      </w:r>
+      <w:proofErr w:type="spellStart"/>
+      <w:r>
+        <w:t>Out</w:t>
+      </w:r>
+      <w:proofErr w:type="spellEnd"/>
+      <w:r>
+        <w:t>.</w:t>
+      </w:r>
+    </w:p>
+    <w:p>
+      <w:r>
+        <w:rPr>
+          <w:noProof/>
+          <w:lang w:eastAsia="es-ES"/>
+        </w:rPr>
         <w:drawing>
           <wp:inline distT="0" distB="0" distL="0" distR="0" wp14:anchorId="25EF41CF" wp14:editId="66BC6D5A">
             <wp:extent cx="5400040" cy="1713865"/>
@@ -2233,6 +2443,10 @@
     </w:p>
     <w:p>
       <w:r>
+        <w:rPr>
+          <w:noProof/>
+          <w:lang w:eastAsia="es-ES"/>
+        </w:rPr>
         <w:drawing>
           <wp:inline distT="0" distB="0" distL="0" distR="0" wp14:anchorId="65BBF6A7" wp14:editId="76F24027">
             <wp:extent cx="5400040" cy="342265"/>
@@ -2272,6 +2486,10 @@
     </w:p>
     <w:p>
       <w:r>
+        <w:rPr>
+          <w:noProof/>
+          <w:lang w:eastAsia="es-ES"/>
+        </w:rPr>
         <w:drawing>
           <wp:inline distT="0" distB="0" distL="0" distR="0" wp14:anchorId="4694100E" wp14:editId="3938B48A">
             <wp:extent cx="5400040" cy="222885"/>
@@ -2311,6 +2529,10 @@
     </w:p>
     <w:p>
       <w:r>
+        <w:rPr>
+          <w:noProof/>
+          <w:lang w:eastAsia="es-ES"/>
+        </w:rPr>
         <w:drawing>
           <wp:inline distT="0" distB="0" distL="0" distR="0" wp14:anchorId="4F72E899" wp14:editId="065226F4">
             <wp:extent cx="5400040" cy="360045"/>
@@ -2350,6 +2572,10 @@
     </w:p>
     <w:p>
       <w:r>
+        <w:rPr>
+          <w:noProof/>
+          <w:lang w:eastAsia="es-ES"/>
+        </w:rPr>
         <w:drawing>
           <wp:inline distT="0" distB="0" distL="0" distR="0" wp14:anchorId="18AD0B4D" wp14:editId="41974657">
             <wp:extent cx="5400040" cy="278765"/>
@@ -2389,6 +2615,10 @@
     </w:p>
     <w:p>
       <w:r>
+        <w:rPr>
+          <w:noProof/>
+          <w:lang w:eastAsia="es-ES"/>
+        </w:rPr>
         <w:drawing>
           <wp:inline distT="0" distB="0" distL="0" distR="0" wp14:anchorId="63724860" wp14:editId="324F83BC">
             <wp:extent cx="5400040" cy="251460"/>
@@ -2428,6 +2658,10 @@
     </w:p>
     <w:p>
       <w:r>
+        <w:rPr>
+          <w:noProof/>
+          <w:lang w:eastAsia="es-ES"/>
+        </w:rPr>
         <w:drawing>
           <wp:inline distT="0" distB="0" distL="0" distR="0" wp14:anchorId="2F7D9C9D" wp14:editId="00EDFA4C">
             <wp:extent cx="5400040" cy="2865120"/>
@@ -2467,20 +2701,45 @@
     </w:p>
     <w:p>
       <w:r>
-        <w:t>Finalmente, ha llegado a null. No hay más documento a leer. El código se nos marca en gris.</w:t>
+        <w:t xml:space="preserve">Finalmente, ha llegado a </w:t>
+      </w:r>
+      <w:proofErr w:type="spellStart"/>
+      <w:r>
+        <w:t>null</w:t>
+      </w:r>
+      <w:proofErr w:type="spellEnd"/>
+      <w:r>
+        <w:t>. No hay más documento a leer. El código se nos marca en gris.</w:t>
       </w:r>
     </w:p>
     <w:p>
       <w:r>
         <w:lastRenderedPageBreak/>
-        <w:t>Le damos a Step Over</w:t>
-      </w:r>
+        <w:t xml:space="preserve">Le damos a </w:t>
+      </w:r>
+      <w:proofErr w:type="spellStart"/>
+      <w:r>
+        <w:t>Step</w:t>
+      </w:r>
+      <w:proofErr w:type="spellEnd"/>
+      <w:r>
+        <w:t xml:space="preserve"> </w:t>
+      </w:r>
+      <w:proofErr w:type="spellStart"/>
+      <w:r>
+        <w:t>Over</w:t>
+      </w:r>
+      <w:proofErr w:type="spellEnd"/>
       <w:r>
         <w:t>, y ahora vamos a tener que ir a seleccionar a crear objeto.</w:t>
       </w:r>
     </w:p>
     <w:p>
       <w:r>
+        <w:rPr>
+          <w:noProof/>
+          <w:lang w:eastAsia="es-ES"/>
+        </w:rPr>
         <w:drawing>
           <wp:inline distT="0" distB="0" distL="0" distR="0" wp14:anchorId="44A7DF1F" wp14:editId="772773DD">
             <wp:extent cx="3810532" cy="1486107"/>
@@ -2525,6 +2784,10 @@
     </w:p>
     <w:p>
       <w:r>
+        <w:rPr>
+          <w:noProof/>
+          <w:lang w:eastAsia="es-ES"/>
+        </w:rPr>
         <w:drawing>
           <wp:inline distT="0" distB="0" distL="0" distR="0" wp14:anchorId="3F94D527" wp14:editId="4BC21A59">
             <wp:extent cx="685896" cy="314369"/>
@@ -2569,6 +2832,10 @@
     </w:p>
     <w:p>
       <w:r>
+        <w:rPr>
+          <w:noProof/>
+          <w:lang w:eastAsia="es-ES"/>
+        </w:rPr>
         <w:drawing>
           <wp:inline distT="0" distB="0" distL="0" distR="0" wp14:anchorId="7079B8B9" wp14:editId="08B07CBC">
             <wp:extent cx="3315163" cy="2191056"/>
@@ -2613,6 +2880,10 @@
     </w:p>
     <w:p>
       <w:r>
+        <w:rPr>
+          <w:noProof/>
+          <w:lang w:eastAsia="es-ES"/>
+        </w:rPr>
         <w:drawing>
           <wp:inline distT="0" distB="0" distL="0" distR="0" wp14:anchorId="75ADDE95" wp14:editId="2A40F35D">
             <wp:extent cx="4163006" cy="905001"/>
@@ -2657,6 +2928,10 @@
     </w:p>
     <w:p>
       <w:r>
+        <w:rPr>
+          <w:noProof/>
+          <w:lang w:eastAsia="es-ES"/>
+        </w:rPr>
         <w:drawing>
           <wp:inline distT="0" distB="0" distL="0" distR="0" wp14:anchorId="18C50CBB" wp14:editId="5A862285">
             <wp:extent cx="3277057" cy="1171739"/>
@@ -2703,6 +2978,10 @@
     <w:p/>
     <w:p>
       <w:r>
+        <w:rPr>
+          <w:noProof/>
+          <w:lang w:eastAsia="es-ES"/>
+        </w:rPr>
         <w:lastRenderedPageBreak/>
         <w:drawing>
           <wp:inline distT="0" distB="0" distL="0" distR="0" wp14:anchorId="66E7382F" wp14:editId="4F63442E">
@@ -2748,6 +3027,10 @@
     </w:p>
     <w:p>
       <w:r>
+        <w:rPr>
+          <w:noProof/>
+          <w:lang w:eastAsia="es-ES"/>
+        </w:rPr>
         <w:drawing>
           <wp:inline distT="0" distB="0" distL="0" distR="0" wp14:anchorId="2E3B8223" wp14:editId="3BFC41FF">
             <wp:extent cx="5400040" cy="219075"/>
@@ -2792,6 +3075,10 @@
     </w:p>
     <w:p>
       <w:r>
+        <w:rPr>
+          <w:noProof/>
+          <w:lang w:eastAsia="es-ES"/>
+        </w:rPr>
         <w:drawing>
           <wp:inline distT="0" distB="0" distL="0" distR="0" wp14:anchorId="577C9FD6" wp14:editId="630CCA87">
             <wp:extent cx="3400900" cy="2029108"/>
@@ -2833,11 +3120,31 @@
         <w:t>Vemos las variables activas.</w:t>
       </w:r>
       <w:r>
-        <w:t xml:space="preserve"> Todas coinciden. Podemos ahora seguir con Step Into y ver el constructor.</w:t>
-      </w:r>
-    </w:p>
-    <w:p>
-      <w:r>
+        <w:t xml:space="preserve"> Todas coinciden. Podemos ahora seguir con </w:t>
+      </w:r>
+      <w:proofErr w:type="spellStart"/>
+      <w:r>
+        <w:t>Step</w:t>
+      </w:r>
+      <w:proofErr w:type="spellEnd"/>
+      <w:r>
+        <w:t xml:space="preserve"> </w:t>
+      </w:r>
+      <w:proofErr w:type="spellStart"/>
+      <w:r>
+        <w:t>Into</w:t>
+      </w:r>
+      <w:proofErr w:type="spellEnd"/>
+      <w:r>
+        <w:t xml:space="preserve"> y ver el constructor.</w:t>
+      </w:r>
+    </w:p>
+    <w:p>
+      <w:r>
+        <w:rPr>
+          <w:noProof/>
+          <w:lang w:eastAsia="es-ES"/>
+        </w:rPr>
         <w:drawing>
           <wp:inline distT="0" distB="0" distL="0" distR="0" wp14:anchorId="7CC28B8F" wp14:editId="4E70EA14">
             <wp:extent cx="5400040" cy="1183640"/>
@@ -2877,11 +3184,31 @@
     </w:p>
     <w:p>
       <w:r>
-        <w:t>Y desde aquí seguimos con Step Over, viendo cómo se construye.</w:t>
-      </w:r>
-    </w:p>
-    <w:p>
-      <w:r>
+        <w:t xml:space="preserve">Y desde aquí seguimos con </w:t>
+      </w:r>
+      <w:proofErr w:type="spellStart"/>
+      <w:r>
+        <w:t>Step</w:t>
+      </w:r>
+      <w:proofErr w:type="spellEnd"/>
+      <w:r>
+        <w:t xml:space="preserve"> </w:t>
+      </w:r>
+      <w:proofErr w:type="spellStart"/>
+      <w:r>
+        <w:t>Over</w:t>
+      </w:r>
+      <w:proofErr w:type="spellEnd"/>
+      <w:r>
+        <w:t>, viendo cómo se construye.</w:t>
+      </w:r>
+    </w:p>
+    <w:p>
+      <w:r>
+        <w:rPr>
+          <w:noProof/>
+          <w:lang w:eastAsia="es-ES"/>
+        </w:rPr>
         <w:lastRenderedPageBreak/>
         <w:drawing>
           <wp:inline distT="0" distB="0" distL="0" distR="0" wp14:anchorId="5CD0E84A" wp14:editId="556C55B8">
@@ -2920,11 +3247,23 @@
         </w:drawing>
       </w:r>
       <w:r>
-        <w:t>Sobrescribiendo los valores que anteriormente eran null.</w:t>
-      </w:r>
-    </w:p>
-    <w:p>
-      <w:r>
+        <w:t xml:space="preserve">Sobrescribiendo los valores que anteriormente eran </w:t>
+      </w:r>
+      <w:proofErr w:type="spellStart"/>
+      <w:r>
+        <w:t>null</w:t>
+      </w:r>
+      <w:proofErr w:type="spellEnd"/>
+      <w:r>
+        <w:t>.</w:t>
+      </w:r>
+    </w:p>
+    <w:p>
+      <w:r>
+        <w:rPr>
+          <w:noProof/>
+          <w:lang w:eastAsia="es-ES"/>
+        </w:rPr>
         <w:drawing>
           <wp:inline distT="0" distB="0" distL="0" distR="0" wp14:anchorId="382150D5" wp14:editId="7126BED0">
             <wp:extent cx="5400040" cy="1147445"/>
@@ -2967,6 +3306,10 @@
     </w:p>
     <w:p>
       <w:r>
+        <w:rPr>
+          <w:noProof/>
+          <w:lang w:eastAsia="es-ES"/>
+        </w:rPr>
         <w:drawing>
           <wp:inline distT="0" distB="0" distL="0" distR="0" wp14:anchorId="76731DAE" wp14:editId="3946A09C">
             <wp:extent cx="5400040" cy="1202055"/>
@@ -3011,6 +3354,10 @@
     </w:p>
     <w:p>
       <w:r>
+        <w:rPr>
+          <w:noProof/>
+          <w:lang w:eastAsia="es-ES"/>
+        </w:rPr>
         <w:drawing>
           <wp:inline distT="0" distB="0" distL="0" distR="0" wp14:anchorId="658C5903" wp14:editId="543FA7D9">
             <wp:extent cx="5400040" cy="2759075"/>
@@ -3050,7 +3397,28 @@
     </w:p>
     <w:p>
       <w:r>
-        <w:t>Y estamos de vuelta en el método main, fuera de este método auxiliar crearProducto().</w:t>
+        <w:t xml:space="preserve">Y estamos de vuelta en el método </w:t>
+      </w:r>
+      <w:proofErr w:type="spellStart"/>
+      <w:r>
+        <w:t>main</w:t>
+      </w:r>
+      <w:proofErr w:type="spellEnd"/>
+      <w:r>
+        <w:t xml:space="preserve">, fuera de este método auxiliar </w:t>
+      </w:r>
+      <w:proofErr w:type="spellStart"/>
+      <w:proofErr w:type="gramStart"/>
+      <w:r>
+        <w:t>crearProducto</w:t>
+      </w:r>
+      <w:proofErr w:type="spellEnd"/>
+      <w:r>
+        <w:t>(</w:t>
+      </w:r>
+      <w:proofErr w:type="gramEnd"/>
+      <w:r>
+        <w:t>).</w:t>
       </w:r>
     </w:p>
     <w:p>
@@ -3059,6 +3427,10 @@
         <w:tab/>
       </w:r>
       <w:r>
+        <w:rPr>
+          <w:noProof/>
+          <w:lang w:eastAsia="es-ES"/>
+        </w:rPr>
         <w:drawing>
           <wp:inline distT="0" distB="0" distL="0" distR="0" wp14:anchorId="29170EEB" wp14:editId="74A4141A">
             <wp:extent cx="5400040" cy="557530"/>
@@ -3103,6 +3475,10 @@
     </w:p>
     <w:p>
       <w:r>
+        <w:rPr>
+          <w:noProof/>
+          <w:lang w:eastAsia="es-ES"/>
+        </w:rPr>
         <w:drawing>
           <wp:inline distT="0" distB="0" distL="0" distR="0" wp14:anchorId="55A41544" wp14:editId="12D0BA3B">
             <wp:extent cx="5400040" cy="611505"/>
@@ -3142,11 +3518,39 @@
     </w:p>
     <w:p>
       <w:r>
-        <w:t>Y ahora se inserta dentro de nuestro almacén de datos. Podemos ver que ahora nos devuelve null, ya que un LinkedHashMap devuelve la casilla que la Key reemplaza, que en este caso no existía anteriormente, por lo que nos devuelve null.</w:t>
-      </w:r>
-    </w:p>
-    <w:p>
-      <w:r>
+        <w:t xml:space="preserve">Y ahora se inserta dentro de nuestro almacén de datos. Podemos ver que ahora nos devuelve </w:t>
+      </w:r>
+      <w:proofErr w:type="spellStart"/>
+      <w:r>
+        <w:t>null</w:t>
+      </w:r>
+      <w:proofErr w:type="spellEnd"/>
+      <w:r>
+        <w:t xml:space="preserve">, ya que un </w:t>
+      </w:r>
+      <w:proofErr w:type="spellStart"/>
+      <w:r>
+        <w:t>LinkedHashMap</w:t>
+      </w:r>
+      <w:proofErr w:type="spellEnd"/>
+      <w:r>
+        <w:t xml:space="preserve"> devuelve la casilla que la Key reemplaza, que en este caso no existía anteriormente, por lo que nos devuelve </w:t>
+      </w:r>
+      <w:proofErr w:type="spellStart"/>
+      <w:r>
+        <w:t>null</w:t>
+      </w:r>
+      <w:proofErr w:type="spellEnd"/>
+      <w:r>
+        <w:t>.</w:t>
+      </w:r>
+    </w:p>
+    <w:p>
+      <w:r>
+        <w:rPr>
+          <w:noProof/>
+          <w:lang w:eastAsia="es-ES"/>
+        </w:rPr>
         <w:drawing>
           <wp:inline distT="0" distB="0" distL="0" distR="0" wp14:anchorId="6C852BD1" wp14:editId="4BEEEE95">
             <wp:extent cx="5400040" cy="1802130"/>
@@ -3186,11 +3590,31 @@
     </w:p>
     <w:p>
       <w:r>
-        <w:t>Efectivamente, al tener devuelto null, significa que nos hemos deshecho del archivo dentro de storage, por lo que confirmamos que ha sido creado exitosamente.</w:t>
-      </w:r>
-    </w:p>
-    <w:p>
-      <w:r>
+        <w:t xml:space="preserve">Efectivamente, al tener devuelto </w:t>
+      </w:r>
+      <w:proofErr w:type="spellStart"/>
+      <w:r>
+        <w:t>null</w:t>
+      </w:r>
+      <w:proofErr w:type="spellEnd"/>
+      <w:r>
+        <w:t xml:space="preserve">, significa que nos hemos deshecho del archivo dentro de </w:t>
+      </w:r>
+      <w:proofErr w:type="spellStart"/>
+      <w:r>
+        <w:t>storage</w:t>
+      </w:r>
+      <w:proofErr w:type="spellEnd"/>
+      <w:r>
+        <w:t>, por lo que confirmamos que ha sido creado exitosamente.</w:t>
+      </w:r>
+    </w:p>
+    <w:p>
+      <w:r>
+        <w:rPr>
+          <w:noProof/>
+          <w:lang w:eastAsia="es-ES"/>
+        </w:rPr>
         <w:drawing>
           <wp:inline distT="0" distB="0" distL="0" distR="0" wp14:anchorId="28439522" wp14:editId="43BD0C5F">
             <wp:extent cx="5400040" cy="2025015"/>
@@ -3230,11 +3654,31 @@
     </w:p>
     <w:p>
       <w:r>
-        <w:t>Se salta el else, y declaramos que la variable “necesitar cambios de confirmar”, que hemos llamado allSaved, se vuelve false, aunque ya era false.</w:t>
-      </w:r>
-    </w:p>
-    <w:p>
-      <w:r>
+        <w:t xml:space="preserve">Se salta el </w:t>
+      </w:r>
+      <w:proofErr w:type="spellStart"/>
+      <w:r>
+        <w:t>else</w:t>
+      </w:r>
+      <w:proofErr w:type="spellEnd"/>
+      <w:r>
+        <w:t xml:space="preserve">, y declaramos que la variable “necesitar cambios de confirmar”, que hemos llamado </w:t>
+      </w:r>
+      <w:proofErr w:type="spellStart"/>
+      <w:r>
+        <w:t>allSaved</w:t>
+      </w:r>
+      <w:proofErr w:type="spellEnd"/>
+      <w:r>
+        <w:t>, se vuelve false, aunque ya era false.</w:t>
+      </w:r>
+    </w:p>
+    <w:p>
+      <w:r>
+        <w:rPr>
+          <w:noProof/>
+          <w:lang w:eastAsia="es-ES"/>
+        </w:rPr>
         <w:lastRenderedPageBreak/>
         <w:drawing>
           <wp:inline distT="0" distB="0" distL="0" distR="0" wp14:anchorId="46907C3E" wp14:editId="2FFB274C">
@@ -3281,7 +3725,23 @@
         </w:rPr>
       </w:pPr>
       <w:r>
-        <w:t>Y all llegar al pause() el programa continua ya que se necesita de input.</w:t>
+        <w:t xml:space="preserve">Y </w:t>
+      </w:r>
+      <w:proofErr w:type="spellStart"/>
+      <w:r>
+        <w:t>all</w:t>
+      </w:r>
+      <w:proofErr w:type="spellEnd"/>
+      <w:r>
+        <w:t xml:space="preserve"> llegar al </w:t>
+      </w:r>
+      <w:proofErr w:type="gramStart"/>
+      <w:r>
+        <w:t>pause(</w:t>
+      </w:r>
+      <w:proofErr w:type="gramEnd"/>
+      <w:r>
+        <w:t>) el programa continua ya que se necesita de input.</w:t>
       </w:r>
       <w:r>
         <w:rPr>
@@ -3291,6 +3751,10 @@
         <w:t xml:space="preserve"> </w:t>
       </w:r>
       <w:r>
+        <w:rPr>
+          <w:noProof/>
+          <w:lang w:eastAsia="es-ES"/>
+        </w:rPr>
         <w:drawing>
           <wp:inline distT="0" distB="0" distL="0" distR="0" wp14:anchorId="511F611B" wp14:editId="3BDD2220">
             <wp:extent cx="5400040" cy="2696210"/>
@@ -3345,6 +3809,10 @@
     </w:p>
     <w:p>
       <w:r>
+        <w:rPr>
+          <w:noProof/>
+          <w:lang w:eastAsia="es-ES"/>
+        </w:rPr>
         <w:lastRenderedPageBreak/>
         <w:drawing>
           <wp:inline distT="0" distB="0" distL="0" distR="0" wp14:anchorId="2D72ECE2" wp14:editId="2CF669FA">
@@ -3383,11 +3851,23 @@
         </w:drawing>
       </w:r>
       <w:r>
-        <w:t>Le damos valores mientras esté pausado, y continuamos leyendo. Aunque ahora también vamos a usar este momento para realizar unas consultas a nuestro último objeto, ahora ya en storage.</w:t>
-      </w:r>
-    </w:p>
-    <w:p>
-      <w:r>
+        <w:t xml:space="preserve">Le damos valores mientras esté pausado, y continuamos leyendo. Aunque ahora también vamos a usar este momento para realizar unas consultas a nuestro último objeto, ahora ya en </w:t>
+      </w:r>
+      <w:proofErr w:type="spellStart"/>
+      <w:r>
+        <w:t>storage</w:t>
+      </w:r>
+      <w:proofErr w:type="spellEnd"/>
+      <w:r>
+        <w:t>.</w:t>
+      </w:r>
+    </w:p>
+    <w:p>
+      <w:r>
+        <w:rPr>
+          <w:noProof/>
+          <w:lang w:eastAsia="es-ES"/>
+        </w:rPr>
         <w:drawing>
           <wp:inline distT="0" distB="0" distL="0" distR="0" wp14:anchorId="044C676D" wp14:editId="02287EA4">
             <wp:extent cx="3372321" cy="762106"/>
@@ -3432,6 +3912,10 @@
     </w:p>
     <w:p>
       <w:r>
+        <w:rPr>
+          <w:noProof/>
+          <w:lang w:eastAsia="es-ES"/>
+        </w:rPr>
         <w:drawing>
           <wp:inline distT="0" distB="0" distL="0" distR="0" wp14:anchorId="668F1C56" wp14:editId="1B3F0961">
             <wp:extent cx="5400040" cy="588645"/>
@@ -3471,6 +3955,10 @@
     </w:p>
     <w:p>
       <w:r>
+        <w:rPr>
+          <w:noProof/>
+          <w:lang w:eastAsia="es-ES"/>
+        </w:rPr>
         <w:drawing>
           <wp:inline distT="0" distB="0" distL="0" distR="0" wp14:anchorId="5C579B90" wp14:editId="27F7CE89">
             <wp:extent cx="3639058" cy="847843"/>
@@ -3510,11 +3998,23 @@
     </w:p>
     <w:p>
       <w:r>
-        <w:t>Podemos intentar probar a realizar cambios aquí. A través del debug.</w:t>
-      </w:r>
-    </w:p>
-    <w:p>
-      <w:r>
+        <w:t xml:space="preserve">Podemos intentar probar a realizar cambios aquí. A través del </w:t>
+      </w:r>
+      <w:proofErr w:type="spellStart"/>
+      <w:r>
+        <w:t>debug</w:t>
+      </w:r>
+      <w:proofErr w:type="spellEnd"/>
+      <w:r>
+        <w:t>.</w:t>
+      </w:r>
+    </w:p>
+    <w:p>
+      <w:r>
+        <w:rPr>
+          <w:noProof/>
+          <w:lang w:eastAsia="es-ES"/>
+        </w:rPr>
         <w:drawing>
           <wp:inline distT="0" distB="0" distL="0" distR="0" wp14:anchorId="68BB34D6" wp14:editId="70E6D220">
             <wp:extent cx="5400040" cy="1200785"/>
@@ -3554,11 +4054,23 @@
     </w:p>
     <w:p>
       <w:r>
-        <w:t>Y desde aquí abrimos storage y comprobamos.</w:t>
-      </w:r>
-    </w:p>
-    <w:p>
-      <w:r>
+        <w:t xml:space="preserve">Y desde aquí abrimos </w:t>
+      </w:r>
+      <w:proofErr w:type="spellStart"/>
+      <w:r>
+        <w:t>storage</w:t>
+      </w:r>
+      <w:proofErr w:type="spellEnd"/>
+      <w:r>
+        <w:t xml:space="preserve"> y comprobamos.</w:t>
+      </w:r>
+    </w:p>
+    <w:p>
+      <w:r>
+        <w:rPr>
+          <w:noProof/>
+          <w:lang w:eastAsia="es-ES"/>
+        </w:rPr>
         <w:lastRenderedPageBreak/>
         <w:drawing>
           <wp:inline distT="0" distB="0" distL="0" distR="0" wp14:anchorId="62181467" wp14:editId="50D39A25">
@@ -3597,7 +4109,15 @@
         </w:drawing>
       </w:r>
       <w:r>
-        <w:t>Efectivamente, se ha guardado de forma correcta la cantidad usando el set dentro del propio debuggeador.</w:t>
+        <w:t xml:space="preserve">Efectivamente, se ha guardado de forma correcta la cantidad usando el set dentro del propio </w:t>
+      </w:r>
+      <w:proofErr w:type="spellStart"/>
+      <w:r>
+        <w:t>debuggeador</w:t>
+      </w:r>
+      <w:proofErr w:type="spellEnd"/>
+      <w:r>
+        <w:t>.</w:t>
       </w:r>
     </w:p>
     <w:p>
@@ -3676,6 +4196,7 @@
         <w:docPartUnique/>
       </w:docPartObj>
     </w:sdtPr>
+    <w:sdtEndPr/>
     <w:sdtContent>
       <w:p>
         <w:pPr>
@@ -3760,7 +4281,7 @@
                                   <w:noProof/>
                                   <w:color w:val="5B9BD5" w:themeColor="accent1"/>
                                 </w:rPr>
-                                <w:t>1</w:t>
+                                <w:t>2</w:t>
                               </w:r>
                               <w:r>
                                 <w:rPr>
@@ -3812,7 +4333,7 @@
                             <w:noProof/>
                             <w:color w:val="5B9BD5" w:themeColor="accent1"/>
                           </w:rPr>
-                          <w:t>1</w:t>
+                          <w:t>2</w:t>
                         </w:r>
                         <w:r>
                           <w:rPr>
@@ -4837,7 +5358,7 @@
 </file>
 
 <file path=customXml/itemProps1.xml><?xml version="1.0" encoding="utf-8"?>
-<ds:datastoreItem xmlns:ds="http://schemas.openxmlformats.org/officeDocument/2006/customXml" ds:itemID="{D6CD6AE2-76B3-41DA-812E-F665A8FC2C41}">
+<ds:datastoreItem xmlns:ds="http://schemas.openxmlformats.org/officeDocument/2006/customXml" ds:itemID="{5F68897D-2E02-4B9F-92F4-B16A6E7E0491}">
   <ds:schemaRefs>
     <ds:schemaRef ds:uri="http://schemas.openxmlformats.org/officeDocument/2006/bibliography"/>
   </ds:schemaRefs>

</xml_diff>